<commit_message>
Updated Operation Guide with desktop instead of laptop. Also added into report (outside repo)
</commit_message>
<xml_diff>
--- a/guide_linearPendulumGantry.docx
+++ b/guide_linearPendulumGantry.docx
@@ -16,7 +16,7 @@
           <w:lang w:val="en-GB" w:eastAsia="de-AT"/>
         </w:rPr>
         <w:drawing>
-          <wp:anchor distT="0" distB="0" distL="114300" distR="114300" simplePos="0" relativeHeight="251659264" behindDoc="1" locked="0" layoutInCell="1" allowOverlap="1" wp14:anchorId="357F0DED" wp14:editId="462EA0BF">
+          <wp:anchor distT="0" distB="0" distL="114300" distR="114300" simplePos="0" relativeHeight="251659264" behindDoc="1" locked="0" layoutInCell="1" allowOverlap="1" wp14:anchorId="357F0DED" wp14:editId="10453994">
             <wp:simplePos x="0" y="0"/>
             <wp:positionH relativeFrom="margin">
               <wp:align>right</wp:align>
@@ -730,7 +730,7 @@
         <mc:AlternateContent>
           <mc:Choice Requires="wps">
             <w:drawing>
-              <wp:anchor distT="0" distB="0" distL="114300" distR="114300" simplePos="0" relativeHeight="251661312" behindDoc="0" locked="0" layoutInCell="1" allowOverlap="1" wp14:anchorId="160BFC75" wp14:editId="5E934E95">
+              <wp:anchor distT="0" distB="0" distL="114300" distR="114300" simplePos="0" relativeHeight="251661312" behindDoc="0" locked="0" layoutInCell="1" allowOverlap="1" wp14:anchorId="160BFC75" wp14:editId="12DF6450">
                 <wp:simplePos x="0" y="0"/>
                 <wp:positionH relativeFrom="column">
                   <wp:posOffset>2286915</wp:posOffset>
@@ -806,7 +806,7 @@
           </mc:Choice>
           <mc:Fallback>
             <w:pict>
-              <v:shapetype w14:anchorId="2FC5DB90" id="_x0000_t32" coordsize="21600,21600" o:spt="32" o:oned="t" path="m,l21600,21600e" filled="f">
+              <v:shapetype w14:anchorId="06AED815" id="_x0000_t32" coordsize="21600,21600" o:spt="32" o:oned="t" path="m,l21600,21600e" filled="f">
                 <v:path arrowok="t" fillok="f" o:connecttype="none"/>
                 <o:lock v:ext="edit" shapetype="t"/>
               </v:shapetype>
@@ -819,6 +819,142 @@
       </w:r>
       <w:r>
         <w:rPr>
+          <w:sz w:val="24"/>
+          <w:szCs w:val="24"/>
+          <w:lang w:val="en-GB"/>
+        </w:rPr>
+        <w:t xml:space="preserve">Quanser </w:t>
+      </w:r>
+      <w:r>
+        <w:rPr>
+          <w:sz w:val="24"/>
+          <w:szCs w:val="24"/>
+          <w:lang w:val="en-GB"/>
+        </w:rPr>
+        <w:t>Q2</w:t>
+      </w:r>
+      <w:r>
+        <w:rPr>
+          <w:sz w:val="24"/>
+          <w:szCs w:val="24"/>
+          <w:lang w:val="en-GB"/>
+        </w:rPr>
+        <w:t>-USB</w:t>
+      </w:r>
+      <w:r>
+        <w:rPr>
+          <w:sz w:val="24"/>
+          <w:szCs w:val="24"/>
+          <w:lang w:val="en-GB"/>
+        </w:rPr>
+        <w:t xml:space="preserve"> (</w:t>
+      </w:r>
+      <w:r>
+        <w:rPr>
+          <w:sz w:val="24"/>
+          <w:szCs w:val="24"/>
+          <w:lang w:val="en-GB"/>
+        </w:rPr>
+        <w:t xml:space="preserve">USB </w:t>
+      </w:r>
+      <w:r>
+        <w:rPr>
+          <w:sz w:val="24"/>
+          <w:szCs w:val="24"/>
+          <w:lang w:val="en-GB"/>
+        </w:rPr>
+        <w:br/>
+      </w:r>
+      <w:r>
+        <w:rPr>
+          <w:sz w:val="24"/>
+          <w:szCs w:val="24"/>
+          <w:lang w:val="en-GB"/>
+        </w:rPr>
+        <w:t>Data Acquisition Board</w:t>
+      </w:r>
+      <w:r>
+        <w:rPr>
+          <w:sz w:val="24"/>
+          <w:szCs w:val="24"/>
+          <w:lang w:val="en-GB"/>
+        </w:rPr>
+        <w:t>)</w:t>
+      </w:r>
+    </w:p>
+    <w:p>
+      <w:pPr>
+        <w:pStyle w:val="ListParagraph"/>
+        <w:numPr>
+          <w:ilvl w:val="0"/>
+          <w:numId w:val="19"/>
+        </w:numPr>
+        <w:suppressAutoHyphens/>
+        <w:jc w:val="left"/>
+        <w:rPr>
+          <w:sz w:val="24"/>
+          <w:szCs w:val="24"/>
+          <w:lang w:val="en-GB"/>
+        </w:rPr>
+      </w:pPr>
+      <w:r>
+        <w:rPr>
+          <w:sz w:val="24"/>
+          <w:szCs w:val="24"/>
+          <w:lang w:val="en-GB"/>
+        </w:rPr>
+        <w:t xml:space="preserve">Gantry with </w:t>
+      </w:r>
+      <w:r>
+        <w:rPr>
+          <w:sz w:val="24"/>
+          <w:szCs w:val="24"/>
+          <w:lang w:val="en-GB"/>
+        </w:rPr>
+        <w:t>C</w:t>
+      </w:r>
+      <w:r>
+        <w:rPr>
+          <w:sz w:val="24"/>
+          <w:szCs w:val="24"/>
+          <w:lang w:val="en-GB"/>
+        </w:rPr>
+        <w:t xml:space="preserve">art and </w:t>
+      </w:r>
+      <w:r>
+        <w:rPr>
+          <w:sz w:val="24"/>
+          <w:szCs w:val="24"/>
+          <w:lang w:val="en-GB"/>
+        </w:rPr>
+        <w:t>P</w:t>
+      </w:r>
+      <w:r>
+        <w:rPr>
+          <w:sz w:val="24"/>
+          <w:szCs w:val="24"/>
+          <w:lang w:val="en-GB"/>
+        </w:rPr>
+        <w:t>endulum</w:t>
+      </w:r>
+    </w:p>
+    <w:p>
+      <w:pPr>
+        <w:pStyle w:val="ListParagraph"/>
+        <w:numPr>
+          <w:ilvl w:val="0"/>
+          <w:numId w:val="19"/>
+        </w:numPr>
+        <w:suppressAutoHyphens/>
+        <w:jc w:val="left"/>
+        <w:rPr>
+          <w:sz w:val="24"/>
+          <w:szCs w:val="24"/>
+          <w:lang w:val="en-GB"/>
+        </w:rPr>
+      </w:pPr>
+      <w:r>
+        <w:rPr>
           <w:noProof/>
           <w:sz w:val="24"/>
           <w:szCs w:val="24"/>
@@ -827,89 +963,31 @@
         <mc:AlternateContent>
           <mc:Choice Requires="wps">
             <w:drawing>
-              <wp:anchor distT="0" distB="0" distL="114300" distR="114300" simplePos="0" relativeHeight="251666432" behindDoc="0" locked="0" layoutInCell="1" allowOverlap="1" wp14:anchorId="67D2CF4C" wp14:editId="488353A9">
+              <wp:anchor distT="0" distB="0" distL="114300" distR="114300" simplePos="0" relativeHeight="251670528" behindDoc="0" locked="0" layoutInCell="1" allowOverlap="1" wp14:anchorId="3BB3EAD1" wp14:editId="048905C8">
                 <wp:simplePos x="0" y="0"/>
                 <wp:positionH relativeFrom="column">
-                  <wp:posOffset>980237</wp:posOffset>
+                  <wp:posOffset>1060024</wp:posOffset>
                 </wp:positionH>
                 <wp:positionV relativeFrom="paragraph">
-                  <wp:posOffset>188290</wp:posOffset>
+                  <wp:posOffset>59716</wp:posOffset>
                 </wp:positionV>
-                <wp:extent cx="3920947" cy="1384493"/>
-                <wp:effectExtent l="152400" t="133350" r="118110" b="177800"/>
+                <wp:extent cx="1468384" cy="45719"/>
+                <wp:effectExtent l="76200" t="171450" r="36830" b="145415"/>
                 <wp:wrapNone/>
-                <wp:docPr id="123044391" name="Freeform: Shape 7"/>
+                <wp:docPr id="1175162945" name="Straight Arrow Connector 2"/>
                 <wp:cNvGraphicFramePr/>
                 <a:graphic xmlns:a="http://schemas.openxmlformats.org/drawingml/2006/main">
                   <a:graphicData uri="http://schemas.microsoft.com/office/word/2010/wordprocessingShape">
                     <wps:wsp>
-                      <wps:cNvSpPr/>
+                      <wps:cNvCnPr/>
                       <wps:spPr>
-                        <a:xfrm>
+                        <a:xfrm flipV="1">
                           <a:off x="0" y="0"/>
-                          <a:ext cx="3920947" cy="1384493"/>
+                          <a:ext cx="1468384" cy="45719"/>
                         </a:xfrm>
-                        <a:custGeom>
+                        <a:prstGeom prst="straightConnector1">
                           <a:avLst/>
-                          <a:gdLst>
-                            <a:gd name="connsiteX0" fmla="*/ 0 w 3920947"/>
-                            <a:gd name="connsiteY0" fmla="*/ 709575 h 1384493"/>
-                            <a:gd name="connsiteX1" fmla="*/ 972921 w 3920947"/>
-                            <a:gd name="connsiteY1" fmla="*/ 724205 h 1384493"/>
-                            <a:gd name="connsiteX2" fmla="*/ 1660550 w 3920947"/>
-                            <a:gd name="connsiteY2" fmla="*/ 1280160 h 1384493"/>
-                            <a:gd name="connsiteX3" fmla="*/ 3277209 w 3920947"/>
-                            <a:gd name="connsiteY3" fmla="*/ 1258215 h 1384493"/>
-                            <a:gd name="connsiteX4" fmla="*/ 3920947 w 3920947"/>
-                            <a:gd name="connsiteY4" fmla="*/ 0 h 1384493"/>
-                          </a:gdLst>
-                          <a:ahLst/>
-                          <a:cxnLst>
-                            <a:cxn ang="0">
-                              <a:pos x="connsiteX0" y="connsiteY0"/>
-                            </a:cxn>
-                            <a:cxn ang="0">
-                              <a:pos x="connsiteX1" y="connsiteY1"/>
-                            </a:cxn>
-                            <a:cxn ang="0">
-                              <a:pos x="connsiteX2" y="connsiteY2"/>
-                            </a:cxn>
-                            <a:cxn ang="0">
-                              <a:pos x="connsiteX3" y="connsiteY3"/>
-                            </a:cxn>
-                            <a:cxn ang="0">
-                              <a:pos x="connsiteX4" y="connsiteY4"/>
-                            </a:cxn>
-                          </a:cxnLst>
-                          <a:rect l="l" t="t" r="r" b="b"/>
-                          <a:pathLst>
-                            <a:path w="3920947" h="1384493">
-                              <a:moveTo>
-                                <a:pt x="0" y="709575"/>
-                              </a:moveTo>
-                              <a:cubicBezTo>
-                                <a:pt x="348081" y="669341"/>
-                                <a:pt x="696163" y="629108"/>
-                                <a:pt x="972921" y="724205"/>
-                              </a:cubicBezTo>
-                              <a:cubicBezTo>
-                                <a:pt x="1249679" y="819302"/>
-                                <a:pt x="1276502" y="1191158"/>
-                                <a:pt x="1660550" y="1280160"/>
-                              </a:cubicBezTo>
-                              <a:cubicBezTo>
-                                <a:pt x="2044598" y="1369162"/>
-                                <a:pt x="2900476" y="1471575"/>
-                                <a:pt x="3277209" y="1258215"/>
-                              </a:cubicBezTo>
-                              <a:cubicBezTo>
-                                <a:pt x="3653942" y="1044855"/>
-                                <a:pt x="3803904" y="198730"/>
-                                <a:pt x="3920947" y="0"/>
-                              </a:cubicBezTo>
-                            </a:path>
-                          </a:pathLst>
-                        </a:custGeom>
+                        </a:prstGeom>
                         <a:ln w="19050" cap="flat" cmpd="sng" algn="ctr">
                           <a:solidFill>
                             <a:schemeClr val="accent5"/>
@@ -920,7 +998,7 @@
                           <a:tailEnd type="arrow" w="med" len="med"/>
                         </a:ln>
                         <a:effectLst>
-                          <a:glow rad="127000">
+                          <a:glow rad="101600">
                             <a:schemeClr val="bg1"/>
                           </a:glow>
                         </a:effectLst>
@@ -946,23 +1024,23 @@
                           <a:schemeClr val="tx1"/>
                         </a:fontRef>
                       </wps:style>
-                      <wps:bodyPr rot="0" spcFirstLastPara="0" vertOverflow="overflow" horzOverflow="overflow" vert="horz" wrap="square" lIns="91440" tIns="45720" rIns="91440" bIns="45720" numCol="1" spcCol="0" rtlCol="0" fromWordArt="0" anchor="ctr" anchorCtr="0" forceAA="0" compatLnSpc="1">
-                        <a:prstTxWarp prst="textNoShape">
-                          <a:avLst/>
-                        </a:prstTxWarp>
-                        <a:noAutofit/>
-                      </wps:bodyPr>
+                      <wps:bodyPr/>
                     </wps:wsp>
                   </a:graphicData>
                 </a:graphic>
+                <wp14:sizeRelH relativeFrom="margin">
+                  <wp14:pctWidth>0</wp14:pctWidth>
+                </wp14:sizeRelH>
+                <wp14:sizeRelV relativeFrom="margin">
+                  <wp14:pctHeight>0</wp14:pctHeight>
+                </wp14:sizeRelV>
               </wp:anchor>
             </w:drawing>
           </mc:Choice>
           <mc:Fallback>
             <w:pict>
-              <v:shape w14:anchorId="443C7561" id="Freeform: Shape 7" o:spid="_x0000_s1026" style="position:absolute;margin-left:77.2pt;margin-top:14.85pt;width:308.75pt;height:109pt;z-index:251666432;visibility:visible;mso-wrap-style:square;mso-wrap-distance-left:9pt;mso-wrap-distance-top:0;mso-wrap-distance-right:9pt;mso-wrap-distance-bottom:0;mso-position-horizontal:absolute;mso-position-horizontal-relative:text;mso-position-vertical:absolute;mso-position-vertical-relative:text;v-text-anchor:middle" coordsize="3920947,1384493" o:gfxdata="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" path="m,709575v348081,-40234,696163,-80467,972921,14630c1249679,819302,1276502,1191158,1660550,1280160v384048,89002,1239926,191415,1616659,-21945c3653942,1044855,3803904,198730,3920947,e" filled="f" strokecolor="#5b9bd5 [3208]" strokeweight="1.5pt">
+              <v:shape w14:anchorId="46657151" id="Straight Arrow Connector 2" o:spid="_x0000_s1026" type="#_x0000_t32" style="position:absolute;margin-left:83.45pt;margin-top:4.7pt;width:115.6pt;height:3.6pt;flip:y;z-index:251670528;visibility:visible;mso-wrap-style:square;mso-width-percent:0;mso-height-percent:0;mso-wrap-distance-left:9pt;mso-wrap-distance-top:0;mso-wrap-distance-right:9pt;mso-wrap-distance-bottom:0;mso-position-horizontal:absolute;mso-position-horizontal-relative:text;mso-position-vertical:absolute;mso-position-vertical-relative:text;mso-width-percent:0;mso-height-percent:0;mso-width-relative:margin;mso-height-relative:margin" o:gfxdata="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" strokecolor="#5b9bd5 [3208]" strokeweight="1.5pt">
                 <v:stroke endarrow="open"/>
-                <v:path arrowok="t" o:connecttype="custom" o:connectlocs="0,709575;972921,724205;1660550,1280160;3277209,1258215;3920947,0" o:connectangles="0,0,0,0,0"/>
               </v:shape>
             </w:pict>
           </mc:Fallback>
@@ -974,143 +1052,7 @@
           <w:szCs w:val="24"/>
           <w:lang w:val="en-GB"/>
         </w:rPr>
-        <w:t xml:space="preserve">Quanser </w:t>
-      </w:r>
-      <w:r>
-        <w:rPr>
-          <w:sz w:val="24"/>
-          <w:szCs w:val="24"/>
-          <w:lang w:val="en-GB"/>
-        </w:rPr>
-        <w:t>Q2</w:t>
-      </w:r>
-      <w:r>
-        <w:rPr>
-          <w:sz w:val="24"/>
-          <w:szCs w:val="24"/>
-          <w:lang w:val="en-GB"/>
-        </w:rPr>
-        <w:t>-USB</w:t>
-      </w:r>
-      <w:r>
-        <w:rPr>
-          <w:sz w:val="24"/>
-          <w:szCs w:val="24"/>
-          <w:lang w:val="en-GB"/>
-        </w:rPr>
-        <w:t xml:space="preserve"> (</w:t>
-      </w:r>
-      <w:r>
-        <w:rPr>
-          <w:sz w:val="24"/>
-          <w:szCs w:val="24"/>
-          <w:lang w:val="en-GB"/>
-        </w:rPr>
-        <w:t xml:space="preserve">USB </w:t>
-      </w:r>
-      <w:r>
-        <w:rPr>
-          <w:sz w:val="24"/>
-          <w:szCs w:val="24"/>
-          <w:lang w:val="en-GB"/>
-        </w:rPr>
-        <w:br/>
-      </w:r>
-      <w:r>
-        <w:rPr>
-          <w:sz w:val="24"/>
-          <w:szCs w:val="24"/>
-          <w:lang w:val="en-GB"/>
-        </w:rPr>
-        <w:t>Data Acquisition Board</w:t>
-      </w:r>
-      <w:r>
-        <w:rPr>
-          <w:sz w:val="24"/>
-          <w:szCs w:val="24"/>
-          <w:lang w:val="en-GB"/>
-        </w:rPr>
-        <w:t>)</w:t>
-      </w:r>
-    </w:p>
-    <w:p>
-      <w:pPr>
-        <w:pStyle w:val="ListParagraph"/>
-        <w:numPr>
-          <w:ilvl w:val="0"/>
-          <w:numId w:val="19"/>
-        </w:numPr>
-        <w:suppressAutoHyphens/>
-        <w:jc w:val="left"/>
-        <w:rPr>
-          <w:sz w:val="24"/>
-          <w:szCs w:val="24"/>
-          <w:lang w:val="en-GB"/>
-        </w:rPr>
-      </w:pPr>
-      <w:r>
-        <w:rPr>
-          <w:sz w:val="24"/>
-          <w:szCs w:val="24"/>
-          <w:lang w:val="en-GB"/>
-        </w:rPr>
-        <w:t xml:space="preserve">Gantry with </w:t>
-      </w:r>
-      <w:r>
-        <w:rPr>
-          <w:sz w:val="24"/>
-          <w:szCs w:val="24"/>
-          <w:lang w:val="en-GB"/>
-        </w:rPr>
-        <w:t>C</w:t>
-      </w:r>
-      <w:r>
-        <w:rPr>
-          <w:sz w:val="24"/>
-          <w:szCs w:val="24"/>
-          <w:lang w:val="en-GB"/>
-        </w:rPr>
-        <w:t xml:space="preserve">art and </w:t>
-      </w:r>
-      <w:r>
-        <w:rPr>
-          <w:sz w:val="24"/>
-          <w:szCs w:val="24"/>
-          <w:lang w:val="en-GB"/>
-        </w:rPr>
-        <w:t>P</w:t>
-      </w:r>
-      <w:r>
-        <w:rPr>
-          <w:sz w:val="24"/>
-          <w:szCs w:val="24"/>
-          <w:lang w:val="en-GB"/>
-        </w:rPr>
-        <w:t>endulum</w:t>
-      </w:r>
-    </w:p>
-    <w:p>
-      <w:pPr>
-        <w:pStyle w:val="ListParagraph"/>
-        <w:numPr>
-          <w:ilvl w:val="0"/>
-          <w:numId w:val="19"/>
-        </w:numPr>
-        <w:suppressAutoHyphens/>
-        <w:jc w:val="left"/>
-        <w:rPr>
-          <w:sz w:val="24"/>
-          <w:szCs w:val="24"/>
-          <w:lang w:val="en-GB"/>
-        </w:rPr>
-      </w:pPr>
-      <w:r>
-        <w:rPr>
-          <w:sz w:val="24"/>
-          <w:szCs w:val="24"/>
-          <w:lang w:val="en-GB"/>
-        </w:rPr>
-        <w:t>Laptop</w:t>
+        <w:t>Computer</w:t>
       </w:r>
       <w:r>
         <w:rPr>
@@ -1468,7 +1410,25 @@
           <w:szCs w:val="24"/>
           <w:lang w:val="en-GB"/>
         </w:rPr>
-        <w:t xml:space="preserve"> Laptop USB Port</w:t>
+        <w:t xml:space="preserve"> </w:t>
+      </w:r>
+      <w:r>
+        <w:rPr>
+          <w:rFonts w:eastAsiaTheme="minorEastAsia"/>
+          <w:sz w:val="24"/>
+          <w:szCs w:val="24"/>
+          <w:lang w:val="en-GB"/>
+        </w:rPr>
+        <w:t>Computer</w:t>
+      </w:r>
+      <w:r>
+        <w:rPr>
+          <w:rFonts w:eastAsiaTheme="minorEastAsia"/>
+          <w:sz w:val="24"/>
+          <w:szCs w:val="24"/>
+          <w:lang w:val="en-GB"/>
+        </w:rPr>
+        <w:t xml:space="preserve"> USB Port</w:t>
       </w:r>
     </w:p>
     <w:p>
@@ -1476,10 +1436,6 @@
         <w:suppressAutoHyphens/>
         <w:jc w:val="left"/>
         <w:rPr>
-          <w:b/>
-          <w:bCs/>
-          <w:sz w:val="24"/>
-          <w:szCs w:val="24"/>
           <w:lang w:val="en-GB"/>
         </w:rPr>
       </w:pPr>
@@ -1493,135 +1449,7 @@
         <w:rPr>
           <w:lang w:val="en-GB"/>
         </w:rPr>
-        <w:t xml:space="preserve">As of writing this guide the computer setup is with the monitor connected to both </w:t>
-      </w:r>
-      <w:r>
-        <w:rPr>
-          <w:lang w:val="en-GB"/>
-        </w:rPr>
-        <w:br/>
-        <w:t>the stationary computer using DisplayPort</w:t>
-      </w:r>
-      <w:r>
-        <w:rPr>
-          <w:lang w:val="en-GB"/>
-        </w:rPr>
-        <w:t xml:space="preserve"> </w:t>
-      </w:r>
-      <w:r>
-        <w:rPr>
-          <w:i/>
-          <w:iCs/>
-          <w:lang w:val="en-GB"/>
-        </w:rPr>
-        <w:t>(not used)</w:t>
-      </w:r>
-      <w:r>
-        <w:rPr>
-          <w:lang w:val="en-GB"/>
-        </w:rPr>
-        <w:t xml:space="preserve"> and the </w:t>
-      </w:r>
-      <w:r>
-        <w:rPr>
-          <w:b/>
-          <w:bCs/>
-          <w:lang w:val="en-GB"/>
-        </w:rPr>
-        <w:t>laptop using HDMI</w:t>
-      </w:r>
-      <w:r>
-        <w:rPr>
-          <w:b/>
-          <w:bCs/>
-          <w:lang w:val="en-GB"/>
-        </w:rPr>
-        <w:t>, which can be used for operation of the system</w:t>
-      </w:r>
-      <w:r>
-        <w:rPr>
-          <w:b/>
-          <w:bCs/>
-          <w:lang w:val="en-GB"/>
-        </w:rPr>
-        <w:t xml:space="preserve"> if desired</w:t>
-      </w:r>
-      <w:r>
-        <w:rPr>
-          <w:b/>
-          <w:bCs/>
-          <w:lang w:val="en-GB"/>
-        </w:rPr>
-        <w:t>.</w:t>
-      </w:r>
-    </w:p>
-    <w:p>
-      <w:pPr>
-        <w:suppressAutoHyphens/>
-        <w:ind w:firstLine="360"/>
-        <w:jc w:val="left"/>
-        <w:rPr>
-          <w:lang w:val="en-GB"/>
-        </w:rPr>
-      </w:pPr>
-      <m:oMath>
-        <m:r>
-          <w:rPr>
-            <w:rFonts w:ascii="Cambria Math" w:hAnsi="Cambria Math"/>
-            <w:lang w:val="en-GB"/>
-          </w:rPr>
-          <m:t>↑</m:t>
-        </m:r>
-      </m:oMath>
-      <w:r>
-        <w:rPr>
-          <w:rFonts w:eastAsiaTheme="minorEastAsia"/>
-          <w:lang w:val="en-GB"/>
-        </w:rPr>
-        <w:t xml:space="preserve"> </w:t>
-      </w:r>
-      <w:r>
-        <w:rPr>
-          <w:lang w:val="en-GB"/>
-        </w:rPr>
-        <w:t>Switch by pressing 2</w:t>
-      </w:r>
-      <w:r>
-        <w:rPr>
-          <w:vertAlign w:val="superscript"/>
-          <w:lang w:val="en-GB"/>
-        </w:rPr>
-        <w:t>nd</w:t>
-      </w:r>
-      <w:r>
-        <w:rPr>
-          <w:lang w:val="en-GB"/>
-        </w:rPr>
-        <w:t xml:space="preserve"> button from the left </w:t>
-      </w:r>
-      <w:r>
-        <w:rPr>
-          <w:lang w:val="en-GB"/>
-        </w:rPr>
-        <w:t xml:space="preserve">(bottom of </w:t>
-      </w:r>
-      <w:r>
-        <w:rPr>
-          <w:lang w:val="en-GB"/>
-        </w:rPr>
-        <w:t>monitor</w:t>
-      </w:r>
-      <w:r>
-        <w:rPr>
-          <w:lang w:val="en-GB"/>
-        </w:rPr>
-        <w:t xml:space="preserve">) </w:t>
-      </w:r>
-      <w:r>
-        <w:rPr>
-          <w:lang w:val="en-GB"/>
-        </w:rPr>
-        <w:t>twice, then select desired port</w:t>
+        <w:t>The current setup utilizes the desktop computer, as the laptop was too slow.</w:t>
       </w:r>
     </w:p>
     <w:p>
@@ -1692,7 +1520,23 @@
           <w:szCs w:val="24"/>
           <w:lang w:val="en-GB"/>
         </w:rPr>
-        <w:t xml:space="preserve">Log onto laptop </w:t>
+        <w:t xml:space="preserve">Log onto </w:t>
+      </w:r>
+      <w:r>
+        <w:rPr>
+          <w:sz w:val="24"/>
+          <w:szCs w:val="24"/>
+          <w:lang w:val="en-GB"/>
+        </w:rPr>
+        <w:t>computer</w:t>
+      </w:r>
+      <w:r>
+        <w:rPr>
+          <w:sz w:val="24"/>
+          <w:szCs w:val="24"/>
+          <w:lang w:val="en-GB"/>
+        </w:rPr>
+        <w:t xml:space="preserve"> </w:t>
       </w:r>
       <w:r>
         <w:rPr>
@@ -1870,8 +1714,18 @@
           <w:szCs w:val="24"/>
           <w:lang w:val="en-GB"/>
         </w:rPr>
-        <w:t xml:space="preserve"> cursor, press ALT+spacebar</w:t>
-      </w:r>
+        <w:t xml:space="preserve"> cursor, press </w:t>
+      </w:r>
+      <w:proofErr w:type="spellStart"/>
+      <w:r>
+        <w:rPr>
+          <w:sz w:val="24"/>
+          <w:szCs w:val="24"/>
+          <w:lang w:val="en-GB"/>
+        </w:rPr>
+        <w:t>ALT+spacebar</w:t>
+      </w:r>
+      <w:proofErr w:type="spellEnd"/>
       <w:r>
         <w:rPr>
           <w:sz w:val="24"/>
@@ -1904,7 +1758,7 @@
           <w:lang w:val="en-GB"/>
         </w:rPr>
         <w:drawing>
-          <wp:anchor distT="0" distB="0" distL="114300" distR="114300" simplePos="0" relativeHeight="251668480" behindDoc="0" locked="0" layoutInCell="1" allowOverlap="1" wp14:anchorId="32309EE8" wp14:editId="6FC2D524">
+          <wp:anchor distT="0" distB="0" distL="114300" distR="114300" simplePos="0" relativeHeight="251668480" behindDoc="0" locked="0" layoutInCell="1" allowOverlap="1" wp14:anchorId="32309EE8" wp14:editId="489B7E33">
             <wp:simplePos x="0" y="0"/>
             <wp:positionH relativeFrom="column">
               <wp:posOffset>4367530</wp:posOffset>
@@ -2054,23 +1908,7 @@
           <w:szCs w:val="24"/>
           <w:lang w:val="en-GB"/>
         </w:rPr>
-        <w:t>voltage amplifier (</w:t>
-      </w:r>
-      <w:r>
-        <w:rPr>
-          <w:sz w:val="24"/>
-          <w:szCs w:val="24"/>
-          <w:lang w:val="en-GB"/>
-        </w:rPr>
-        <w:t>Quanser VoltPAQ X-1</w:t>
-      </w:r>
-      <w:r>
-        <w:rPr>
-          <w:sz w:val="24"/>
-          <w:szCs w:val="24"/>
-          <w:lang w:val="en-GB"/>
-        </w:rPr>
-        <w:t>)</w:t>
+        <w:t>voltage amplifier (Quanser VoltPAQ X-1)</w:t>
       </w:r>
     </w:p>
     <w:p>
@@ -2278,7 +2116,25 @@
           <w:szCs w:val="24"/>
           <w:lang w:val="en-GB"/>
         </w:rPr>
-        <w:t>Check analog read/write</w:t>
+        <w:t xml:space="preserve">Check </w:t>
+      </w:r>
+      <w:proofErr w:type="spellStart"/>
+      <w:r>
+        <w:rPr>
+          <w:sz w:val="24"/>
+          <w:szCs w:val="24"/>
+          <w:lang w:val="en-GB"/>
+        </w:rPr>
+        <w:t>analog</w:t>
+      </w:r>
+      <w:proofErr w:type="spellEnd"/>
+      <w:r>
+        <w:rPr>
+          <w:sz w:val="24"/>
+          <w:szCs w:val="24"/>
+          <w:lang w:val="en-GB"/>
+        </w:rPr>
+        <w:t xml:space="preserve"> read/write</w:t>
       </w:r>
       <w:r>
         <w:rPr>
@@ -2288,6 +2144,7 @@
         </w:rPr>
         <w:t xml:space="preserve"> with </w:t>
       </w:r>
+      <w:proofErr w:type="spellStart"/>
       <w:r>
         <w:rPr>
           <w:b/>
@@ -2296,7 +2153,18 @@
           <w:szCs w:val="24"/>
           <w:lang w:val="en-GB"/>
         </w:rPr>
-        <w:t xml:space="preserve">Quarc Read/Write </w:t>
+        <w:t>Quarc</w:t>
+      </w:r>
+      <w:proofErr w:type="spellEnd"/>
+      <w:r>
+        <w:rPr>
+          <w:b/>
+          <w:bCs/>
+          <w:sz w:val="24"/>
+          <w:szCs w:val="24"/>
+          <w:lang w:val="en-GB"/>
+        </w:rPr>
+        <w:t xml:space="preserve"> Read/Write </w:t>
       </w:r>
       <w:r>
         <w:rPr>
@@ -2340,6 +2208,7 @@
         </w:rPr>
         <w:t xml:space="preserve"> </w:t>
       </w:r>
+      <w:proofErr w:type="spellStart"/>
       <w:r>
         <w:rPr>
           <w:rFonts w:ascii="Consolas" w:hAnsi="Consolas"/>
@@ -2394,6 +2263,7 @@
         </w:rPr>
         <w:t>slx</w:t>
       </w:r>
+      <w:proofErr w:type="spellEnd"/>
       <w:r>
         <w:rPr>
           <w:rFonts w:ascii="Consolas" w:hAnsi="Consolas"/>
@@ -2500,7 +2370,25 @@
           <w:szCs w:val="24"/>
           <w:lang w:val="en-GB"/>
         </w:rPr>
-        <w:t>, used to test analog outputs</w:t>
+        <w:t xml:space="preserve">, used to test </w:t>
+      </w:r>
+      <w:proofErr w:type="spellStart"/>
+      <w:r>
+        <w:rPr>
+          <w:sz w:val="24"/>
+          <w:szCs w:val="24"/>
+          <w:lang w:val="en-GB"/>
+        </w:rPr>
+        <w:t>analog</w:t>
+      </w:r>
+      <w:proofErr w:type="spellEnd"/>
+      <w:r>
+        <w:rPr>
+          <w:sz w:val="24"/>
+          <w:szCs w:val="24"/>
+          <w:lang w:val="en-GB"/>
+        </w:rPr>
+        <w:t xml:space="preserve"> outputs</w:t>
       </w:r>
       <w:r>
         <w:rPr>
@@ -2695,13 +2583,23 @@
         <w:lastRenderedPageBreak/>
         <w:t xml:space="preserve">Original </w:t>
       </w:r>
-      <w:r>
-        <w:rPr>
-          <w:sz w:val="24"/>
-          <w:szCs w:val="24"/>
-          <w:lang w:val="en-GB"/>
-        </w:rPr>
-        <w:t xml:space="preserve">Quarc </w:t>
+      <w:proofErr w:type="spellStart"/>
+      <w:r>
+        <w:rPr>
+          <w:sz w:val="24"/>
+          <w:szCs w:val="24"/>
+          <w:lang w:val="en-GB"/>
+        </w:rPr>
+        <w:t>Quarc</w:t>
+      </w:r>
+      <w:proofErr w:type="spellEnd"/>
+      <w:r>
+        <w:rPr>
+          <w:sz w:val="24"/>
+          <w:szCs w:val="24"/>
+          <w:lang w:val="en-GB"/>
+        </w:rPr>
+        <w:t xml:space="preserve"> </w:t>
       </w:r>
       <w:r>
         <w:rPr>
@@ -2735,6 +2633,7 @@
         </w:rPr>
         <w:t xml:space="preserve"> found by running </w:t>
       </w:r>
+      <w:proofErr w:type="spellStart"/>
       <w:r>
         <w:rPr>
           <w:rFonts w:ascii="Consolas" w:hAnsi="Consolas" w:cs="Courier New"/>
@@ -2744,6 +2643,7 @@
         </w:rPr>
         <w:t>qc_show_demos</w:t>
       </w:r>
+      <w:proofErr w:type="spellEnd"/>
       <w:r>
         <w:rPr>
           <w:sz w:val="24"/>
@@ -3469,13 +3369,23 @@
         </w:rPr>
         <w:t>“</w:t>
       </w:r>
-      <w:r>
-        <w:rPr>
-          <w:sz w:val="24"/>
-          <w:szCs w:val="24"/>
-          <w:lang w:val="en-GB"/>
-        </w:rPr>
-        <w:t xml:space="preserve">Quarc Read/Write </w:t>
+      <w:proofErr w:type="spellStart"/>
+      <w:r>
+        <w:rPr>
+          <w:sz w:val="24"/>
+          <w:szCs w:val="24"/>
+          <w:lang w:val="en-GB"/>
+        </w:rPr>
+        <w:t>Quarc</w:t>
+      </w:r>
+      <w:proofErr w:type="spellEnd"/>
+      <w:r>
+        <w:rPr>
+          <w:sz w:val="24"/>
+          <w:szCs w:val="24"/>
+          <w:lang w:val="en-GB"/>
+        </w:rPr>
+        <w:t xml:space="preserve"> Read/Write </w:t>
       </w:r>
       <w:r>
         <w:rPr>
@@ -3676,10 +3586,24 @@
   <w:p>
     <w:pPr>
       <w:pStyle w:val="Header"/>
-      <w:rPr>
+      <w:numPr>
+        <w:ilvl w:val="0"/>
+        <w:numId w:val="22"/>
+      </w:numPr>
+      <w:rPr>
+        <w:sz w:val="20"/>
+        <w:szCs w:val="20"/>
         <w:lang w:val="en-US"/>
       </w:rPr>
     </w:pPr>
+    <w:r>
+      <w:rPr>
+        <w:sz w:val="20"/>
+        <w:szCs w:val="20"/>
+        <w:lang w:val="en-US"/>
+      </w:rPr>
+      <w:t>Winter semester 2025/2026</w:t>
+    </w:r>
   </w:p>
 </w:hdr>
 </file>
@@ -3717,7 +3641,7 @@
         <v:path o:extrusionok="f" gradientshapeok="t" o:connecttype="rect"/>
         <o:lock v:ext="edit" aspectratio="t"/>
       </v:shapetype>
-      <v:shape id="_x0000_i1028" type="#_x0000_t75" style="width:11.5pt;height:11.5pt" o:bullet="t">
+      <v:shape id="_x0000_i1026" type="#_x0000_t75" style="width:11.6pt;height:11.6pt" o:bullet="t">
         <v:imagedata r:id="rId1" o:title="msoD93"/>
       </v:shape>
     </w:pict>
@@ -3948,6 +3872,118 @@
     </w:lvl>
   </w:abstractNum>
   <w:abstractNum w:abstractNumId="2" w15:restartNumberingAfterBreak="0">
+    <w:nsid w:val="23024A82"/>
+    <w:multiLevelType w:val="hybridMultilevel"/>
+    <w:tmpl w:val="052A5DE6"/>
+    <w:lvl w:ilvl="0" w:tplc="708053BE">
+      <w:numFmt w:val="bullet"/>
+      <w:lvlText w:val="-"/>
+      <w:lvlJc w:val="left"/>
+      <w:pPr>
+        <w:ind w:left="720" w:hanging="360"/>
+      </w:pPr>
+      <w:rPr>
+        <w:rFonts w:ascii="Arial" w:eastAsiaTheme="minorHAnsi" w:hAnsi="Arial" w:cs="Arial" w:hint="default"/>
+      </w:rPr>
+    </w:lvl>
+    <w:lvl w:ilvl="1" w:tplc="04140003" w:tentative="1">
+      <w:start w:val="1"/>
+      <w:numFmt w:val="bullet"/>
+      <w:lvlText w:val="o"/>
+      <w:lvlJc w:val="left"/>
+      <w:pPr>
+        <w:ind w:left="1440" w:hanging="360"/>
+      </w:pPr>
+      <w:rPr>
+        <w:rFonts w:ascii="Courier New" w:hAnsi="Courier New" w:cs="Courier New" w:hint="default"/>
+      </w:rPr>
+    </w:lvl>
+    <w:lvl w:ilvl="2" w:tplc="04140005" w:tentative="1">
+      <w:start w:val="1"/>
+      <w:numFmt w:val="bullet"/>
+      <w:lvlText w:val=""/>
+      <w:lvlJc w:val="left"/>
+      <w:pPr>
+        <w:ind w:left="2160" w:hanging="360"/>
+      </w:pPr>
+      <w:rPr>
+        <w:rFonts w:ascii="Wingdings" w:hAnsi="Wingdings" w:hint="default"/>
+      </w:rPr>
+    </w:lvl>
+    <w:lvl w:ilvl="3" w:tplc="04140001" w:tentative="1">
+      <w:start w:val="1"/>
+      <w:numFmt w:val="bullet"/>
+      <w:lvlText w:val=""/>
+      <w:lvlJc w:val="left"/>
+      <w:pPr>
+        <w:ind w:left="2880" w:hanging="360"/>
+      </w:pPr>
+      <w:rPr>
+        <w:rFonts w:ascii="Symbol" w:hAnsi="Symbol" w:hint="default"/>
+      </w:rPr>
+    </w:lvl>
+    <w:lvl w:ilvl="4" w:tplc="04140003" w:tentative="1">
+      <w:start w:val="1"/>
+      <w:numFmt w:val="bullet"/>
+      <w:lvlText w:val="o"/>
+      <w:lvlJc w:val="left"/>
+      <w:pPr>
+        <w:ind w:left="3600" w:hanging="360"/>
+      </w:pPr>
+      <w:rPr>
+        <w:rFonts w:ascii="Courier New" w:hAnsi="Courier New" w:cs="Courier New" w:hint="default"/>
+      </w:rPr>
+    </w:lvl>
+    <w:lvl w:ilvl="5" w:tplc="04140005" w:tentative="1">
+      <w:start w:val="1"/>
+      <w:numFmt w:val="bullet"/>
+      <w:lvlText w:val=""/>
+      <w:lvlJc w:val="left"/>
+      <w:pPr>
+        <w:ind w:left="4320" w:hanging="360"/>
+      </w:pPr>
+      <w:rPr>
+        <w:rFonts w:ascii="Wingdings" w:hAnsi="Wingdings" w:hint="default"/>
+      </w:rPr>
+    </w:lvl>
+    <w:lvl w:ilvl="6" w:tplc="04140001" w:tentative="1">
+      <w:start w:val="1"/>
+      <w:numFmt w:val="bullet"/>
+      <w:lvlText w:val=""/>
+      <w:lvlJc w:val="left"/>
+      <w:pPr>
+        <w:ind w:left="5040" w:hanging="360"/>
+      </w:pPr>
+      <w:rPr>
+        <w:rFonts w:ascii="Symbol" w:hAnsi="Symbol" w:hint="default"/>
+      </w:rPr>
+    </w:lvl>
+    <w:lvl w:ilvl="7" w:tplc="04140003" w:tentative="1">
+      <w:start w:val="1"/>
+      <w:numFmt w:val="bullet"/>
+      <w:lvlText w:val="o"/>
+      <w:lvlJc w:val="left"/>
+      <w:pPr>
+        <w:ind w:left="5760" w:hanging="360"/>
+      </w:pPr>
+      <w:rPr>
+        <w:rFonts w:ascii="Courier New" w:hAnsi="Courier New" w:cs="Courier New" w:hint="default"/>
+      </w:rPr>
+    </w:lvl>
+    <w:lvl w:ilvl="8" w:tplc="04140005" w:tentative="1">
+      <w:start w:val="1"/>
+      <w:numFmt w:val="bullet"/>
+      <w:lvlText w:val=""/>
+      <w:lvlJc w:val="left"/>
+      <w:pPr>
+        <w:ind w:left="6480" w:hanging="360"/>
+      </w:pPr>
+      <w:rPr>
+        <w:rFonts w:ascii="Wingdings" w:hAnsi="Wingdings" w:hint="default"/>
+      </w:rPr>
+    </w:lvl>
+  </w:abstractNum>
+  <w:abstractNum w:abstractNumId="3" w15:restartNumberingAfterBreak="0">
     <w:nsid w:val="344276C8"/>
     <w:multiLevelType w:val="hybridMultilevel"/>
     <w:tmpl w:val="6AD6F4FE"/>
@@ -4059,7 +4095,7 @@
       </w:rPr>
     </w:lvl>
   </w:abstractNum>
-  <w:abstractNum w:abstractNumId="3" w15:restartNumberingAfterBreak="0">
+  <w:abstractNum w:abstractNumId="4" w15:restartNumberingAfterBreak="0">
     <w:nsid w:val="3E2A214F"/>
     <w:multiLevelType w:val="multilevel"/>
     <w:tmpl w:val="C2C242BA"/>
@@ -4154,7 +4190,7 @@
       </w:pPr>
     </w:lvl>
   </w:abstractNum>
-  <w:abstractNum w:abstractNumId="4" w15:restartNumberingAfterBreak="0">
+  <w:abstractNum w:abstractNumId="5" w15:restartNumberingAfterBreak="0">
     <w:nsid w:val="4A3E0407"/>
     <w:multiLevelType w:val="hybridMultilevel"/>
     <w:tmpl w:val="5C92B316"/>
@@ -4243,7 +4279,7 @@
       </w:pPr>
     </w:lvl>
   </w:abstractNum>
-  <w:abstractNum w:abstractNumId="5" w15:restartNumberingAfterBreak="0">
+  <w:abstractNum w:abstractNumId="6" w15:restartNumberingAfterBreak="0">
     <w:nsid w:val="4EA97BFC"/>
     <w:multiLevelType w:val="hybridMultilevel"/>
     <w:tmpl w:val="B47A4D36"/>
@@ -4332,7 +4368,7 @@
       </w:pPr>
     </w:lvl>
   </w:abstractNum>
-  <w:abstractNum w:abstractNumId="6" w15:restartNumberingAfterBreak="0">
+  <w:abstractNum w:abstractNumId="7" w15:restartNumberingAfterBreak="0">
     <w:nsid w:val="50744857"/>
     <w:multiLevelType w:val="hybridMultilevel"/>
     <w:tmpl w:val="8F509646"/>
@@ -4445,7 +4481,7 @@
       </w:rPr>
     </w:lvl>
   </w:abstractNum>
-  <w:abstractNum w:abstractNumId="7" w15:restartNumberingAfterBreak="0">
+  <w:abstractNum w:abstractNumId="8" w15:restartNumberingAfterBreak="0">
     <w:nsid w:val="51945C7A"/>
     <w:multiLevelType w:val="hybridMultilevel"/>
     <w:tmpl w:val="04F6A086"/>
@@ -4558,7 +4594,7 @@
       </w:rPr>
     </w:lvl>
   </w:abstractNum>
-  <w:abstractNum w:abstractNumId="8" w15:restartNumberingAfterBreak="0">
+  <w:abstractNum w:abstractNumId="9" w15:restartNumberingAfterBreak="0">
     <w:nsid w:val="547424CE"/>
     <w:multiLevelType w:val="hybridMultilevel"/>
     <w:tmpl w:val="FF8A0304"/>
@@ -4669,7 +4705,7 @@
       </w:rPr>
     </w:lvl>
   </w:abstractNum>
-  <w:abstractNum w:abstractNumId="9" w15:restartNumberingAfterBreak="0">
+  <w:abstractNum w:abstractNumId="10" w15:restartNumberingAfterBreak="0">
     <w:nsid w:val="56CA3DDE"/>
     <w:multiLevelType w:val="hybridMultilevel"/>
     <w:tmpl w:val="5D948824"/>
@@ -4782,7 +4818,7 @@
       </w:rPr>
     </w:lvl>
   </w:abstractNum>
-  <w:abstractNum w:abstractNumId="10" w15:restartNumberingAfterBreak="0">
+  <w:abstractNum w:abstractNumId="11" w15:restartNumberingAfterBreak="0">
     <w:nsid w:val="574133E6"/>
     <w:multiLevelType w:val="hybridMultilevel"/>
     <w:tmpl w:val="72F82CE4"/>
@@ -4868,7 +4904,7 @@
       </w:pPr>
     </w:lvl>
   </w:abstractNum>
-  <w:abstractNum w:abstractNumId="11" w15:restartNumberingAfterBreak="0">
+  <w:abstractNum w:abstractNumId="12" w15:restartNumberingAfterBreak="0">
     <w:nsid w:val="68846746"/>
     <w:multiLevelType w:val="multilevel"/>
     <w:tmpl w:val="9B802000"/>
@@ -5035,7 +5071,7 @@
       </w:rPr>
     </w:lvl>
   </w:abstractNum>
-  <w:abstractNum w:abstractNumId="12" w15:restartNumberingAfterBreak="0">
+  <w:abstractNum w:abstractNumId="13" w15:restartNumberingAfterBreak="0">
     <w:nsid w:val="72805962"/>
     <w:multiLevelType w:val="multilevel"/>
     <w:tmpl w:val="9458A1CC"/>
@@ -5148,7 +5184,7 @@
       </w:pPr>
     </w:lvl>
   </w:abstractNum>
-  <w:abstractNum w:abstractNumId="13" w15:restartNumberingAfterBreak="0">
+  <w:abstractNum w:abstractNumId="14" w15:restartNumberingAfterBreak="0">
     <w:nsid w:val="73FC5124"/>
     <w:multiLevelType w:val="hybridMultilevel"/>
     <w:tmpl w:val="F1D64382"/>
@@ -5234,7 +5270,7 @@
       </w:pPr>
     </w:lvl>
   </w:abstractNum>
-  <w:abstractNum w:abstractNumId="14" w15:restartNumberingAfterBreak="0">
+  <w:abstractNum w:abstractNumId="15" w15:restartNumberingAfterBreak="0">
     <w:nsid w:val="79FC03D6"/>
     <w:multiLevelType w:val="hybridMultilevel"/>
     <w:tmpl w:val="C7103CC2"/>
@@ -5323,7 +5359,7 @@
       </w:pPr>
     </w:lvl>
   </w:abstractNum>
-  <w:abstractNum w:abstractNumId="15" w15:restartNumberingAfterBreak="0">
+  <w:abstractNum w:abstractNumId="16" w15:restartNumberingAfterBreak="0">
     <w:nsid w:val="7F1A6940"/>
     <w:multiLevelType w:val="multilevel"/>
     <w:tmpl w:val="132AA216"/>
@@ -5437,16 +5473,16 @@
     </w:lvl>
   </w:abstractNum>
   <w:num w:numId="1" w16cid:durableId="732966665">
-    <w:abstractNumId w:val="6"/>
+    <w:abstractNumId w:val="7"/>
   </w:num>
   <w:num w:numId="2" w16cid:durableId="784468507">
-    <w:abstractNumId w:val="7"/>
+    <w:abstractNumId w:val="8"/>
   </w:num>
   <w:num w:numId="3" w16cid:durableId="892039357">
-    <w:abstractNumId w:val="11"/>
+    <w:abstractNumId w:val="12"/>
   </w:num>
   <w:num w:numId="4" w16cid:durableId="1381199486">
-    <w:abstractNumId w:val="11"/>
+    <w:abstractNumId w:val="12"/>
     <w:lvlOverride w:ilvl="0">
       <w:startOverride w:val="1"/>
     </w:lvlOverride>
@@ -5476,7 +5512,7 @@
     </w:lvlOverride>
   </w:num>
   <w:num w:numId="5" w16cid:durableId="1573420157">
-    <w:abstractNumId w:val="11"/>
+    <w:abstractNumId w:val="12"/>
     <w:lvlOverride w:ilvl="0">
       <w:startOverride w:val="1"/>
     </w:lvlOverride>
@@ -5506,40 +5542,40 @@
     </w:lvlOverride>
   </w:num>
   <w:num w:numId="6" w16cid:durableId="1242259095">
+    <w:abstractNumId w:val="14"/>
+  </w:num>
+  <w:num w:numId="7" w16cid:durableId="375785391">
+    <w:abstractNumId w:val="6"/>
+  </w:num>
+  <w:num w:numId="8" w16cid:durableId="787894167">
+    <w:abstractNumId w:val="5"/>
+  </w:num>
+  <w:num w:numId="9" w16cid:durableId="1967076925">
+    <w:abstractNumId w:val="12"/>
+  </w:num>
+  <w:num w:numId="10" w16cid:durableId="1263612915">
+    <w:abstractNumId w:val="12"/>
+  </w:num>
+  <w:num w:numId="11" w16cid:durableId="1097335150">
+    <w:abstractNumId w:val="15"/>
+  </w:num>
+  <w:num w:numId="12" w16cid:durableId="1491287962">
+    <w:abstractNumId w:val="4"/>
+  </w:num>
+  <w:num w:numId="13" w16cid:durableId="1114402580">
+    <w:abstractNumId w:val="4"/>
+  </w:num>
+  <w:num w:numId="14" w16cid:durableId="1520461661">
     <w:abstractNumId w:val="13"/>
   </w:num>
-  <w:num w:numId="7" w16cid:durableId="375785391">
-    <w:abstractNumId w:val="5"/>
+  <w:num w:numId="15" w16cid:durableId="1610702643">
+    <w:abstractNumId w:val="16"/>
   </w:num>
-  <w:num w:numId="8" w16cid:durableId="787894167">
-    <w:abstractNumId w:val="4"/>
-  </w:num>
-  <w:num w:numId="9" w16cid:durableId="1967076925">
+  <w:num w:numId="16" w16cid:durableId="1241136670">
     <w:abstractNumId w:val="11"/>
   </w:num>
-  <w:num w:numId="10" w16cid:durableId="1263612915">
-    <w:abstractNumId w:val="11"/>
-  </w:num>
-  <w:num w:numId="11" w16cid:durableId="1097335150">
-    <w:abstractNumId w:val="14"/>
-  </w:num>
-  <w:num w:numId="12" w16cid:durableId="1491287962">
+  <w:num w:numId="17" w16cid:durableId="1384448311">
     <w:abstractNumId w:val="3"/>
-  </w:num>
-  <w:num w:numId="13" w16cid:durableId="1114402580">
-    <w:abstractNumId w:val="3"/>
-  </w:num>
-  <w:num w:numId="14" w16cid:durableId="1520461661">
-    <w:abstractNumId w:val="12"/>
-  </w:num>
-  <w:num w:numId="15" w16cid:durableId="1610702643">
-    <w:abstractNumId w:val="15"/>
-  </w:num>
-  <w:num w:numId="16" w16cid:durableId="1241136670">
-    <w:abstractNumId w:val="10"/>
-  </w:num>
-  <w:num w:numId="17" w16cid:durableId="1384448311">
-    <w:abstractNumId w:val="2"/>
   </w:num>
   <w:num w:numId="18" w16cid:durableId="1397162466">
     <w:abstractNumId w:val="0"/>
@@ -5548,10 +5584,13 @@
     <w:abstractNumId w:val="1"/>
   </w:num>
   <w:num w:numId="20" w16cid:durableId="632054633">
-    <w:abstractNumId w:val="8"/>
+    <w:abstractNumId w:val="9"/>
   </w:num>
   <w:num w:numId="21" w16cid:durableId="1430203046">
-    <w:abstractNumId w:val="9"/>
+    <w:abstractNumId w:val="10"/>
+  </w:num>
+  <w:num w:numId="22" w16cid:durableId="1670906417">
+    <w:abstractNumId w:val="2"/>
   </w:num>
 </w:numbering>
 </file>
@@ -6181,6 +6220,7 @@
   <w:style w:type="character" w:default="1" w:styleId="DefaultParagraphFont">
     <w:name w:val="Default Paragraph Font"/>
     <w:uiPriority w:val="1"/>
+    <w:semiHidden/>
     <w:unhideWhenUsed/>
   </w:style>
   <w:style w:type="table" w:default="1" w:styleId="TableNormal">

</xml_diff>